<commit_message>
file 17 Agustus 2026
</commit_message>
<xml_diff>
--- a/SK PANITIA 17 AN HUT RI KE-81.docx
+++ b/SK PANITIA 17 AN HUT RI KE-81.docx
@@ -38,7 +38,7 @@
           <v:shape id="ole_rId2" type="_x0000_tole_rId2" style="position:absolute;margin-left:2.3pt;margin-top:0.1pt;width:55.3pt;height:65.45pt;mso-wrap-distance-right:0pt;mso-position-horizontal-relative:text;mso-position-vertical-relative:text" filled="t" fillcolor="#FFFFFF" o:ole="">
             <v:imagedata r:id="rId3" o:title=""/>
           </v:shape>
-          <o:OLEObject Type="Embed" ProgID="Word.Picture.8" ShapeID="ole_rId2" DrawAspect="Content" ObjectID="_1537123243" r:id="rId2"/>
+          <o:OLEObject Type="Embed" ProgID="Word.Picture.8" ShapeID="ole_rId2" DrawAspect="Content" ObjectID="_216615858" r:id="rId2"/>
         </w:object>
       </w:r>
       <w:r>
@@ -310,7 +310,7 @@
           <w:sz w:val="22"/>
           <w:szCs w:val="22"/>
         </w:rPr>
-        <w:t>NOMOR :         /DS.VII/X/2026</w:t>
+        <w:t>NOMOR : 010 /DS.VII/X/2026</w:t>
       </w:r>
     </w:p>
     <w:p>
@@ -1894,7 +1894,65 @@
                 <w:szCs w:val="24"/>
                 <w:lang w:bidi="ar-SA"/>
               </w:rPr>
-              <w:t>Ditetapkan di    Lalang Sembawa</w:t>
+              <w:t>Ditetapka</w:t>
+            </w:r>
+            <w:r>
+              <w:drawing>
+                <wp:anchor behindDoc="0" distT="0" distB="0" distL="0" distR="0" simplePos="0" locked="0" layoutInCell="1" allowOverlap="1" relativeHeight="4">
+                  <wp:simplePos x="0" y="0"/>
+                  <wp:positionH relativeFrom="column">
+                    <wp:posOffset>572770</wp:posOffset>
+                  </wp:positionH>
+                  <wp:positionV relativeFrom="paragraph">
+                    <wp:posOffset>137795</wp:posOffset>
+                  </wp:positionV>
+                  <wp:extent cx="1596390" cy="1596390"/>
+                  <wp:effectExtent l="0" t="0" r="0" b="0"/>
+                  <wp:wrapNone/>
+                  <wp:docPr id="2" name="Image1" descr=""/>
+                  <wp:cNvGraphicFramePr>
+                    <a:graphicFrameLocks xmlns:a="http://schemas.openxmlformats.org/drawingml/2006/main" noChangeAspect="1"/>
+                  </wp:cNvGraphicFramePr>
+                  <a:graphic xmlns:a="http://schemas.openxmlformats.org/drawingml/2006/main">
+                    <a:graphicData uri="http://schemas.openxmlformats.org/drawingml/2006/picture">
+                      <pic:pic xmlns:pic="http://schemas.openxmlformats.org/drawingml/2006/picture">
+                        <pic:nvPicPr>
+                          <pic:cNvPr id="2" name="Image1" descr=""/>
+                          <pic:cNvPicPr>
+                            <a:picLocks noChangeAspect="1" noChangeArrowheads="1"/>
+                          </pic:cNvPicPr>
+                        </pic:nvPicPr>
+                        <pic:blipFill>
+                          <a:blip r:embed="rId4"/>
+                          <a:stretch>
+                            <a:fillRect/>
+                          </a:stretch>
+                        </pic:blipFill>
+                        <pic:spPr bwMode="auto">
+                          <a:xfrm>
+                            <a:off x="0" y="0"/>
+                            <a:ext cx="1596390" cy="1596390"/>
+                          </a:xfrm>
+                          <a:prstGeom prst="rect">
+                            <a:avLst/>
+                          </a:prstGeom>
+                          <a:noFill/>
+                        </pic:spPr>
+                      </pic:pic>
+                    </a:graphicData>
+                  </a:graphic>
+                </wp:anchor>
+              </w:drawing>
+            </w:r>
+            <w:r>
+              <w:rPr>
+                <w:rFonts w:eastAsia="宋体" w:cs="Times New Roman" w:ascii="Times New Roman" w:hAnsi="Times New Roman"/>
+                <w:kern w:val="0"/>
+                <w:sz w:val="24"/>
+                <w:szCs w:val="24"/>
+                <w:lang w:bidi="ar-SA"/>
+              </w:rPr>
+              <w:t>n di    Lalang Sembawa</w:t>
             </w:r>
           </w:p>
         </w:tc>
@@ -1932,7 +1990,7 @@
                 <w:szCs w:val="24"/>
                 <w:lang w:bidi="ar-SA"/>
               </w:rPr>
-              <w:t>Pada Tanggal           Agustus 2026</w:t>
+              <w:t>Pada Tanggal      01     Agustus 2026</w:t>
             </w:r>
           </w:p>
         </w:tc>
@@ -2264,7 +2322,7 @@
           <w:sz w:val="24"/>
           <w:szCs w:val="24"/>
         </w:rPr>
-        <w:t>Nomor :      /DS.VII/X/2026</w:t>
+        <w:t>Nomor : 010 /DS.VII/X/2026</w:t>
       </w:r>
     </w:p>
     <w:p>
@@ -2283,7 +2341,7 @@
           <w:sz w:val="24"/>
           <w:szCs w:val="24"/>
         </w:rPr>
-        <w:t>Tanggal :        Agustus 2026</w:t>
+        <w:t>Tanggal :   01   Agustus 2026</w:t>
       </w:r>
     </w:p>
     <w:p>
@@ -4915,6 +4973,30 @@
             </w:pPr>
             <w:r>
               <w:rPr>
+                <w:rFonts w:eastAsia="宋体" w:cs="Times New Roman" w:ascii="Times New Roman" w:hAnsi="Times New Roman"/>
+                <w:kern w:val="0"/>
+                <w:sz w:val="24"/>
+                <w:szCs w:val="24"/>
+                <w:lang w:bidi="ar-SA"/>
+              </w:rPr>
+              <w:t>6. Usman Effendi</w:t>
+            </w:r>
+          </w:p>
+          <w:p>
+            <w:pPr>
+              <w:pStyle w:val="Normal"/>
+              <w:widowControl w:val="false"/>
+              <w:suppressAutoHyphens w:val="true"/>
+              <w:spacing w:lineRule="auto" w:line="360" w:before="0" w:after="0"/>
+              <w:jc w:val="both"/>
+              <w:rPr>
+                <w:rFonts w:ascii="Times New Roman" w:hAnsi="Times New Roman" w:cs="Times New Roman"/>
+                <w:sz w:val="24"/>
+                <w:szCs w:val="24"/>
+              </w:rPr>
+            </w:pPr>
+            <w:r>
+              <w:rPr>
                 <w:rFonts w:cs="Times New Roman" w:ascii="Times New Roman" w:hAnsi="Times New Roman"/>
                 <w:sz w:val="24"/>
                 <w:szCs w:val="24"/>
@@ -5202,7 +5284,7 @@
                 <w:szCs w:val="24"/>
                 <w:lang w:bidi="ar-SA"/>
               </w:rPr>
-              <w:t>Syamsul Bahri</w:t>
+              <w:t>Feri Hendalitas</w:t>
             </w:r>
           </w:p>
         </w:tc>
@@ -5310,17 +5392,7 @@
                 <w:szCs w:val="24"/>
                 <w:lang w:bidi="ar-SA"/>
               </w:rPr>
-              <w:t xml:space="preserve">Feri Hendalitas dan </w:t>
-            </w:r>
-            <w:r>
-              <w:rPr>
-                <w:rFonts w:eastAsia="宋体" w:cs="Times New Roman" w:ascii="Times New Roman" w:hAnsi="Times New Roman"/>
-                <w:kern w:val="0"/>
-                <w:sz w:val="24"/>
-                <w:szCs w:val="24"/>
-                <w:lang w:bidi="ar-SA"/>
-              </w:rPr>
-              <w:t>M. Naufal</w:t>
+              <w:t>Feri Hendalitas dan M. Naufal</w:t>
             </w:r>
           </w:p>
         </w:tc>
@@ -5464,27 +5536,6 @@
                 <w:lang w:bidi="ar-SA"/>
               </w:rPr>
               <w:t>(Penagihan RT 31)</w:t>
-            </w:r>
-          </w:p>
-          <w:p>
-            <w:pPr>
-              <w:pStyle w:val="Normal"/>
-              <w:widowControl w:val="false"/>
-              <w:suppressAutoHyphens w:val="true"/>
-              <w:spacing w:lineRule="auto" w:line="360" w:before="0" w:after="0"/>
-              <w:jc w:val="both"/>
-              <w:rPr>
-                <w:rFonts w:ascii="Times New Roman" w:hAnsi="Times New Roman" w:cs="Times New Roman"/>
-                <w:sz w:val="24"/>
-                <w:szCs w:val="24"/>
-              </w:rPr>
-            </w:pPr>
-            <w:r>
-              <w:rPr>
-                <w:rFonts w:cs="Times New Roman" w:ascii="Times New Roman" w:hAnsi="Times New Roman"/>
-                <w:sz w:val="24"/>
-                <w:szCs w:val="24"/>
-              </w:rPr>
             </w:r>
           </w:p>
           <w:p>
@@ -5829,44 +5880,18 @@
               <w:spacing w:lineRule="auto" w:line="360" w:before="0" w:after="0"/>
               <w:jc w:val="both"/>
               <w:rPr>
-                <w:rFonts w:ascii="Times New Roman" w:hAnsi="Times New Roman" w:cs="Times New Roman"/>
-                <w:sz w:val="24"/>
-                <w:szCs w:val="24"/>
-              </w:rPr>
-            </w:pPr>
-            <w:r>
-              <w:rPr>
-                <w:rFonts w:eastAsia="宋体" w:cs="Times New Roman" w:ascii="Times New Roman" w:hAnsi="Times New Roman"/>
-                <w:kern w:val="0"/>
-                <w:sz w:val="24"/>
-                <w:szCs w:val="24"/>
-                <w:lang w:bidi="ar-SA"/>
-              </w:rPr>
-              <w:t>: Hermansyah</w:t>
-            </w:r>
-          </w:p>
-          <w:p>
-            <w:pPr>
-              <w:pStyle w:val="Normal"/>
-              <w:widowControl w:val="false"/>
-              <w:suppressAutoHyphens w:val="true"/>
-              <w:spacing w:lineRule="auto" w:line="360" w:before="0" w:after="0"/>
-              <w:jc w:val="both"/>
-              <w:rPr>
-                <w:rFonts w:ascii="Times New Roman" w:hAnsi="Times New Roman" w:cs="Times New Roman"/>
-                <w:sz w:val="24"/>
-                <w:szCs w:val="24"/>
-              </w:rPr>
-            </w:pPr>
-            <w:r>
-              <w:rPr>
-                <w:rFonts w:eastAsia="宋体" w:cs="Times New Roman" w:ascii="Times New Roman" w:hAnsi="Times New Roman"/>
-                <w:kern w:val="0"/>
-                <w:sz w:val="24"/>
-                <w:szCs w:val="24"/>
-                <w:lang w:bidi="ar-SA"/>
-              </w:rPr>
-              <w:t>1. Sawiran</w:t>
+                <w:rFonts w:ascii="Liberation Sans" w:hAnsi="Liberation Sans"/>
+              </w:rPr>
+            </w:pPr>
+            <w:r>
+              <w:rPr>
+                <w:rFonts w:eastAsia="宋体" w:cs="Times New Roman" w:ascii="Liberation Sans" w:hAnsi="Liberation Sans"/>
+                <w:kern w:val="0"/>
+                <w:sz w:val="24"/>
+                <w:szCs w:val="24"/>
+                <w:lang w:bidi="ar-SA"/>
+              </w:rPr>
+              <w:t>1. Hermansyah</w:t>
             </w:r>
           </w:p>
           <w:p>
@@ -5881,14 +5906,16 @@
               <w:spacing w:lineRule="auto" w:line="360" w:before="0" w:after="0"/>
               <w:jc w:val="both"/>
               <w:rPr>
-                <w:rFonts w:ascii="Times New Roman" w:hAnsi="Times New Roman" w:cs="Times New Roman"/>
-                <w:sz w:val="24"/>
-                <w:szCs w:val="24"/>
-              </w:rPr>
-            </w:pPr>
-            <w:r>
-              <w:rPr>
-                <w:rFonts w:eastAsia="宋体" w:cs="Times New Roman" w:ascii="Times New Roman" w:hAnsi="Times New Roman"/>
+                <w:rFonts w:ascii="Liberation Sans" w:hAnsi="Liberation Sans" w:eastAsia="宋体" w:cs="Times New Roman"/>
+                <w:kern w:val="0"/>
+                <w:sz w:val="24"/>
+                <w:szCs w:val="24"/>
+                <w:lang w:bidi="ar-SA"/>
+              </w:rPr>
+            </w:pPr>
+            <w:r>
+              <w:rPr>
+                <w:rFonts w:eastAsia="宋体" w:cs="Times New Roman" w:ascii="Liberation Sans" w:hAnsi="Liberation Sans"/>
                 <w:kern w:val="0"/>
                 <w:sz w:val="24"/>
                 <w:szCs w:val="24"/>
@@ -5909,14 +5936,12 @@
               <w:spacing w:lineRule="auto" w:line="360" w:before="0" w:after="0"/>
               <w:jc w:val="both"/>
               <w:rPr>
-                <w:rFonts w:ascii="Times New Roman" w:hAnsi="Times New Roman" w:cs="Times New Roman"/>
-                <w:sz w:val="24"/>
-                <w:szCs w:val="24"/>
-              </w:rPr>
-            </w:pPr>
-            <w:r>
-              <w:rPr>
-                <w:rFonts w:eastAsia="宋体" w:cs="Times New Roman" w:ascii="Times New Roman" w:hAnsi="Times New Roman"/>
+                <w:rFonts w:ascii="Liberation Sans" w:hAnsi="Liberation Sans"/>
+              </w:rPr>
+            </w:pPr>
+            <w:r>
+              <w:rPr>
+                <w:rFonts w:eastAsia="宋体" w:cs="Times New Roman" w:ascii="Liberation Sans" w:hAnsi="Liberation Sans"/>
                 <w:kern w:val="0"/>
                 <w:sz w:val="24"/>
                 <w:szCs w:val="24"/>
@@ -5937,14 +5962,12 @@
               <w:spacing w:lineRule="auto" w:line="360" w:before="0" w:after="0"/>
               <w:jc w:val="both"/>
               <w:rPr>
-                <w:rFonts w:ascii="Times New Roman" w:hAnsi="Times New Roman" w:cs="Times New Roman"/>
-                <w:sz w:val="24"/>
-                <w:szCs w:val="24"/>
-              </w:rPr>
-            </w:pPr>
-            <w:r>
-              <w:rPr>
-                <w:rFonts w:eastAsia="宋体" w:cs="Times New Roman" w:ascii="Times New Roman" w:hAnsi="Times New Roman"/>
+                <w:rFonts w:ascii="Liberation Sans" w:hAnsi="Liberation Sans"/>
+              </w:rPr>
+            </w:pPr>
+            <w:r>
+              <w:rPr>
+                <w:rFonts w:eastAsia="宋体" w:cs="Times New Roman" w:ascii="Liberation Sans" w:hAnsi="Liberation Sans"/>
                 <w:kern w:val="0"/>
                 <w:sz w:val="24"/>
                 <w:szCs w:val="24"/>
@@ -5965,14 +5988,16 @@
               <w:spacing w:lineRule="auto" w:line="360" w:before="0" w:after="0"/>
               <w:jc w:val="both"/>
               <w:rPr>
-                <w:rFonts w:ascii="Times New Roman" w:hAnsi="Times New Roman" w:cs="Times New Roman"/>
-                <w:sz w:val="24"/>
-                <w:szCs w:val="24"/>
-              </w:rPr>
-            </w:pPr>
-            <w:r>
-              <w:rPr>
-                <w:rFonts w:eastAsia="宋体" w:cs="Times New Roman" w:ascii="Times New Roman" w:hAnsi="Times New Roman"/>
+                <w:rFonts w:ascii="Liberation Sans" w:hAnsi="Liberation Sans" w:eastAsia="宋体" w:cs="Times New Roman"/>
+                <w:kern w:val="0"/>
+                <w:sz w:val="24"/>
+                <w:szCs w:val="24"/>
+                <w:lang w:bidi="ar-SA"/>
+              </w:rPr>
+            </w:pPr>
+            <w:r>
+              <w:rPr>
+                <w:rFonts w:eastAsia="宋体" w:cs="Times New Roman" w:ascii="Liberation Sans" w:hAnsi="Liberation Sans"/>
                 <w:kern w:val="0"/>
                 <w:sz w:val="24"/>
                 <w:szCs w:val="24"/>
@@ -5981,17 +6006,6 @@
               <w:t>Nasir AD</w:t>
             </w:r>
           </w:p>
-        </w:tc>
-        <w:tc>
-          <w:tcPr>
-            <w:tcW w:w="3598" w:type="dxa"/>
-            <w:tcBorders>
-              <w:top w:val="nil"/>
-              <w:left w:val="nil"/>
-              <w:bottom w:val="nil"/>
-              <w:right w:val="nil"/>
-            </w:tcBorders>
-          </w:tcPr>
           <w:p>
             <w:pPr>
               <w:pStyle w:val="Normal"/>
@@ -6004,22 +6018,35 @@
               <w:spacing w:lineRule="auto" w:line="360" w:before="0" w:after="0"/>
               <w:jc w:val="both"/>
               <w:rPr>
-                <w:rFonts w:ascii="Times New Roman" w:hAnsi="Times New Roman" w:cs="Times New Roman"/>
-                <w:sz w:val="24"/>
-                <w:szCs w:val="24"/>
-              </w:rPr>
-            </w:pPr>
-            <w:r>
-              <w:rPr>
-                <w:rFonts w:eastAsia="宋体" w:cs="Times New Roman" w:ascii="Times New Roman" w:hAnsi="Times New Roman"/>
-                <w:kern w:val="0"/>
-                <w:sz w:val="24"/>
-                <w:szCs w:val="24"/>
-                <w:lang w:bidi="ar-SA"/>
-              </w:rPr>
-              <w:t>Hamsohar</w:t>
-            </w:r>
-          </w:p>
+                <w:rFonts w:ascii="Liberation Sans" w:hAnsi="Liberation Sans" w:eastAsia="宋体" w:cs="Times New Roman"/>
+                <w:kern w:val="0"/>
+                <w:sz w:val="24"/>
+                <w:szCs w:val="24"/>
+                <w:lang w:bidi="ar-SA"/>
+              </w:rPr>
+            </w:pPr>
+            <w:r>
+              <w:rPr>
+                <w:rFonts w:eastAsia="宋体" w:cs="Times New Roman" w:ascii="Liberation Sans" w:hAnsi="Liberation Sans"/>
+                <w:kern w:val="0"/>
+                <w:sz w:val="24"/>
+                <w:szCs w:val="24"/>
+                <w:lang w:bidi="ar-SA"/>
+              </w:rPr>
+              <w:t>Usman Efendi</w:t>
+            </w:r>
+          </w:p>
+        </w:tc>
+        <w:tc>
+          <w:tcPr>
+            <w:tcW w:w="3598" w:type="dxa"/>
+            <w:tcBorders>
+              <w:top w:val="nil"/>
+              <w:left w:val="nil"/>
+              <w:bottom w:val="nil"/>
+              <w:right w:val="nil"/>
+            </w:tcBorders>
+          </w:tcPr>
           <w:p>
             <w:pPr>
               <w:pStyle w:val="Normal"/>
@@ -6032,20 +6059,18 @@
               <w:spacing w:lineRule="auto" w:line="360" w:before="0" w:after="0"/>
               <w:jc w:val="both"/>
               <w:rPr>
-                <w:rFonts w:ascii="Times New Roman" w:hAnsi="Times New Roman" w:cs="Times New Roman"/>
-                <w:sz w:val="24"/>
-                <w:szCs w:val="24"/>
-              </w:rPr>
-            </w:pPr>
-            <w:r>
-              <w:rPr>
-                <w:rFonts w:eastAsia="宋体" w:cs="Times New Roman" w:ascii="Times New Roman" w:hAnsi="Times New Roman"/>
-                <w:kern w:val="0"/>
-                <w:sz w:val="24"/>
-                <w:szCs w:val="24"/>
-                <w:lang w:bidi="ar-SA"/>
-              </w:rPr>
-              <w:t>Edy Zahara</w:t>
+                <w:rFonts w:ascii="Liberation Sans" w:hAnsi="Liberation Sans"/>
+              </w:rPr>
+            </w:pPr>
+            <w:r>
+              <w:rPr>
+                <w:rFonts w:eastAsia="宋体" w:cs="Times New Roman" w:ascii="Liberation Sans" w:hAnsi="Liberation Sans"/>
+                <w:kern w:val="0"/>
+                <w:sz w:val="24"/>
+                <w:szCs w:val="24"/>
+                <w:lang w:bidi="ar-SA"/>
+              </w:rPr>
+              <w:t>Hamsohar</w:t>
             </w:r>
           </w:p>
           <w:p>
@@ -6060,20 +6085,18 @@
               <w:spacing w:lineRule="auto" w:line="360" w:before="0" w:after="0"/>
               <w:jc w:val="both"/>
               <w:rPr>
-                <w:rFonts w:ascii="Times New Roman" w:hAnsi="Times New Roman" w:cs="Times New Roman"/>
-                <w:sz w:val="24"/>
-                <w:szCs w:val="24"/>
-              </w:rPr>
-            </w:pPr>
-            <w:r>
-              <w:rPr>
-                <w:rFonts w:eastAsia="宋体" w:cs="Times New Roman" w:ascii="Times New Roman" w:hAnsi="Times New Roman"/>
-                <w:kern w:val="0"/>
-                <w:sz w:val="24"/>
-                <w:szCs w:val="24"/>
-                <w:lang w:bidi="ar-SA"/>
-              </w:rPr>
-              <w:t>Salijo</w:t>
+                <w:rFonts w:ascii="Liberation Sans" w:hAnsi="Liberation Sans"/>
+              </w:rPr>
+            </w:pPr>
+            <w:r>
+              <w:rPr>
+                <w:rFonts w:eastAsia="宋体" w:cs="Times New Roman" w:ascii="Liberation Sans" w:hAnsi="Liberation Sans"/>
+                <w:kern w:val="0"/>
+                <w:sz w:val="24"/>
+                <w:szCs w:val="24"/>
+                <w:lang w:bidi="ar-SA"/>
+              </w:rPr>
+              <w:t>Edy Zahara</w:t>
             </w:r>
           </w:p>
           <w:p>
@@ -6088,20 +6111,18 @@
               <w:spacing w:lineRule="auto" w:line="360" w:before="0" w:after="0"/>
               <w:jc w:val="both"/>
               <w:rPr>
-                <w:rFonts w:ascii="Times New Roman" w:hAnsi="Times New Roman" w:cs="Times New Roman"/>
-                <w:sz w:val="24"/>
-                <w:szCs w:val="24"/>
-              </w:rPr>
-            </w:pPr>
-            <w:r>
-              <w:rPr>
-                <w:rFonts w:eastAsia="宋体" w:cs="Times New Roman" w:ascii="Times New Roman" w:hAnsi="Times New Roman"/>
-                <w:kern w:val="0"/>
-                <w:sz w:val="24"/>
-                <w:szCs w:val="24"/>
-                <w:lang w:bidi="ar-SA"/>
-              </w:rPr>
-              <w:t xml:space="preserve">H. Hendri Purnama </w:t>
+                <w:rFonts w:ascii="Liberation Sans" w:hAnsi="Liberation Sans"/>
+              </w:rPr>
+            </w:pPr>
+            <w:r>
+              <w:rPr>
+                <w:rFonts w:eastAsia="宋体" w:cs="Times New Roman" w:ascii="Liberation Sans" w:hAnsi="Liberation Sans"/>
+                <w:kern w:val="0"/>
+                <w:sz w:val="24"/>
+                <w:szCs w:val="24"/>
+                <w:lang w:bidi="ar-SA"/>
+              </w:rPr>
+              <w:t>Salijo</w:t>
             </w:r>
           </w:p>
           <w:p>
@@ -6116,14 +6137,42 @@
               <w:spacing w:lineRule="auto" w:line="360" w:before="0" w:after="0"/>
               <w:jc w:val="both"/>
               <w:rPr>
-                <w:rFonts w:ascii="Times New Roman" w:hAnsi="Times New Roman" w:cs="Times New Roman"/>
-                <w:sz w:val="24"/>
-                <w:szCs w:val="24"/>
-              </w:rPr>
-            </w:pPr>
-            <w:r>
-              <w:rPr>
-                <w:rFonts w:eastAsia="宋体" w:cs="Times New Roman" w:ascii="Times New Roman" w:hAnsi="Times New Roman"/>
+                <w:rFonts w:ascii="Liberation Sans" w:hAnsi="Liberation Sans"/>
+              </w:rPr>
+            </w:pPr>
+            <w:r>
+              <w:rPr>
+                <w:rFonts w:eastAsia="宋体" w:cs="Times New Roman" w:ascii="Liberation Sans" w:hAnsi="Liberation Sans"/>
+                <w:kern w:val="0"/>
+                <w:sz w:val="24"/>
+                <w:szCs w:val="24"/>
+                <w:lang w:bidi="ar-SA"/>
+              </w:rPr>
+              <w:t>H. Hendri Purnama</w:t>
+            </w:r>
+          </w:p>
+          <w:p>
+            <w:pPr>
+              <w:pStyle w:val="Normal"/>
+              <w:widowControl w:val="false"/>
+              <w:numPr>
+                <w:ilvl w:val="0"/>
+                <w:numId w:val="4"/>
+              </w:numPr>
+              <w:suppressAutoHyphens w:val="true"/>
+              <w:spacing w:lineRule="auto" w:line="360" w:before="0" w:after="0"/>
+              <w:jc w:val="both"/>
+              <w:rPr>
+                <w:rFonts w:ascii="Liberation Sans" w:hAnsi="Liberation Sans" w:eastAsia="宋体" w:cs="Times New Roman"/>
+                <w:kern w:val="0"/>
+                <w:sz w:val="24"/>
+                <w:szCs w:val="24"/>
+                <w:lang w:bidi="ar-SA"/>
+              </w:rPr>
+            </w:pPr>
+            <w:r>
+              <w:rPr>
+                <w:rFonts w:eastAsia="宋体" w:cs="Times New Roman" w:ascii="Liberation Sans" w:hAnsi="Liberation Sans"/>
                 <w:kern w:val="0"/>
                 <w:sz w:val="24"/>
                 <w:szCs w:val="24"/>
@@ -6136,18 +6185,82 @@
             <w:pPr>
               <w:pStyle w:val="Normal"/>
               <w:widowControl w:val="false"/>
+              <w:numPr>
+                <w:ilvl w:val="0"/>
+                <w:numId w:val="4"/>
+              </w:numPr>
+              <w:suppressAutoHyphens w:val="true"/>
+              <w:spacing w:lineRule="auto" w:line="360" w:before="0" w:after="0"/>
+              <w:jc w:val="both"/>
+              <w:rPr>
+                <w:rFonts w:ascii="Liberation Sans" w:hAnsi="Liberation Sans" w:eastAsia="宋体" w:cs="Times New Roman"/>
+                <w:kern w:val="0"/>
+                <w:sz w:val="24"/>
+                <w:szCs w:val="24"/>
+                <w:lang w:bidi="ar-SA"/>
+              </w:rPr>
+            </w:pPr>
+            <w:r>
+              <w:rPr>
+                <w:rFonts w:eastAsia="宋体" w:cs="Times New Roman" w:ascii="Liberation Sans" w:hAnsi="Liberation Sans"/>
+                <w:kern w:val="0"/>
+                <w:sz w:val="24"/>
+                <w:szCs w:val="24"/>
+                <w:lang w:bidi="ar-SA"/>
+              </w:rPr>
+              <w:t>Sawiran</w:t>
+            </w:r>
+          </w:p>
+          <w:p>
+            <w:pPr>
+              <w:pStyle w:val="Normal"/>
+              <w:widowControl w:val="false"/>
+              <w:numPr>
+                <w:ilvl w:val="0"/>
+                <w:numId w:val="4"/>
+              </w:numPr>
+              <w:suppressAutoHyphens w:val="true"/>
+              <w:spacing w:lineRule="auto" w:line="360" w:before="0" w:after="0"/>
+              <w:jc w:val="both"/>
+              <w:rPr>
+                <w:rFonts w:ascii="Liberation Sans" w:hAnsi="Liberation Sans" w:eastAsia="宋体" w:cs="Times New Roman"/>
+                <w:kern w:val="0"/>
+                <w:sz w:val="24"/>
+                <w:szCs w:val="24"/>
+                <w:lang w:bidi="ar-SA"/>
+              </w:rPr>
+            </w:pPr>
+            <w:r>
+              <w:rPr>
+                <w:rFonts w:eastAsia="宋体" w:cs="Times New Roman" w:ascii="Liberation Sans" w:hAnsi="Liberation Sans"/>
+                <w:kern w:val="0"/>
+                <w:sz w:val="24"/>
+                <w:szCs w:val="24"/>
+                <w:lang w:bidi="ar-SA"/>
+              </w:rPr>
+              <w:t>Dedi Syahrial</w:t>
+            </w:r>
+          </w:p>
+          <w:p>
+            <w:pPr>
+              <w:pStyle w:val="Normal"/>
+              <w:widowControl w:val="false"/>
               <w:suppressAutoHyphens w:val="true"/>
               <w:spacing w:lineRule="auto" w:line="360" w:before="0" w:after="0"/>
               <w:ind w:left="120"/>
               <w:jc w:val="both"/>
               <w:rPr>
-                <w:rFonts w:ascii="Times New Roman" w:hAnsi="Times New Roman" w:cs="Times New Roman"/>
-                <w:sz w:val="24"/>
-                <w:szCs w:val="24"/>
-              </w:rPr>
-            </w:pPr>
-            <w:r>
-              <w:rPr/>
+                <w:rFonts w:ascii="Liberation Sans" w:hAnsi="Liberation Sans" w:cs="Times New Roman"/>
+                <w:sz w:val="24"/>
+                <w:szCs w:val="24"/>
+              </w:rPr>
+            </w:pPr>
+            <w:r>
+              <w:rPr>
+                <w:rFonts w:cs="Times New Roman" w:ascii="Liberation Sans" w:hAnsi="Liberation Sans"/>
+                <w:sz w:val="24"/>
+                <w:szCs w:val="24"/>
+              </w:rPr>
             </w:r>
           </w:p>
         </w:tc>
@@ -6537,7 +6650,11 @@
               </w:rPr>
             </w:pPr>
             <w:r>
-              <w:rPr/>
+              <w:rPr>
+                <w:rFonts w:cs="Times New Roman" w:ascii="Times New Roman" w:hAnsi="Times New Roman"/>
+                <w:sz w:val="24"/>
+                <w:szCs w:val="24"/>
+              </w:rPr>
             </w:r>
           </w:p>
         </w:tc>
@@ -6697,8 +6814,8 @@
       </w:tblPr>
       <w:tblGrid>
         <w:gridCol w:w="1510"/>
-        <w:gridCol w:w="3754"/>
-        <w:gridCol w:w="3762"/>
+        <w:gridCol w:w="3753"/>
+        <w:gridCol w:w="3763"/>
       </w:tblGrid>
       <w:tr>
         <w:trPr/>
@@ -6743,7 +6860,7 @@
         </w:tc>
         <w:tc>
           <w:tcPr>
-            <w:tcW w:w="3754" w:type="dxa"/>
+            <w:tcW w:w="3753" w:type="dxa"/>
             <w:tcBorders>
               <w:top w:val="nil"/>
               <w:left w:val="nil"/>
@@ -6782,7 +6899,7 @@
         </w:tc>
         <w:tc>
           <w:tcPr>
-            <w:tcW w:w="3762" w:type="dxa"/>
+            <w:tcW w:w="3763" w:type="dxa"/>
             <w:tcBorders>
               <w:top w:val="nil"/>
               <w:left w:val="nil"/>
@@ -6858,7 +6975,7 @@
         </w:tc>
         <w:tc>
           <w:tcPr>
-            <w:tcW w:w="3754" w:type="dxa"/>
+            <w:tcW w:w="3753" w:type="dxa"/>
             <w:tcBorders>
               <w:top w:val="nil"/>
               <w:left w:val="nil"/>
@@ -6974,7 +7091,7 @@
         </w:tc>
         <w:tc>
           <w:tcPr>
-            <w:tcW w:w="3762" w:type="dxa"/>
+            <w:tcW w:w="3763" w:type="dxa"/>
             <w:tcBorders>
               <w:top w:val="nil"/>
               <w:left w:val="nil"/>
@@ -7667,7 +7784,7 @@
                 <w:szCs w:val="24"/>
                 <w:lang w:bidi="ar-SA"/>
               </w:rPr>
-              <w:t>Rehan, S.Pd</w:t>
+              <w:t>Arminto Hidayat</w:t>
             </w:r>
           </w:p>
           <w:p>
@@ -7696,7 +7813,7 @@
                 <w:szCs w:val="24"/>
                 <w:lang w:bidi="ar-SA"/>
               </w:rPr>
-              <w:t>M. Rehan</w:t>
+              <w:t>Rehan, S.Pd</w:t>
             </w:r>
           </w:p>
           <w:p>
@@ -7725,7 +7842,7 @@
                 <w:szCs w:val="24"/>
                 <w:lang w:bidi="ar-SA"/>
               </w:rPr>
-              <w:t>Qori Imam Bukhori</w:t>
+              <w:t>M. Rehan</w:t>
             </w:r>
           </w:p>
           <w:p>
@@ -7754,12 +7871,12 @@
                 <w:szCs w:val="24"/>
                 <w:lang w:bidi="ar-SA"/>
               </w:rPr>
-              <w:t>Naufal Dzakki Salva</w:t>
-            </w:r>
-          </w:p>
-          <w:p>
-            <w:pPr>
-              <w:pStyle w:val="ListParagraph"/>
+              <w:t>Qori Imam Bukhori</w:t>
+            </w:r>
+          </w:p>
+          <w:p>
+            <w:pPr>
+              <w:pStyle w:val="Normal"/>
               <w:widowControl w:val="false"/>
               <w:numPr>
                 <w:ilvl w:val="0"/>
@@ -7768,6 +7885,35 @@
               <w:suppressAutoHyphens w:val="true"/>
               <w:spacing w:lineRule="auto" w:line="360" w:before="0" w:after="0"/>
               <w:ind w:left="0"/>
+              <w:jc w:val="both"/>
+              <w:rPr>
+                <w:rFonts w:ascii="Times New Roman" w:hAnsi="Times New Roman" w:cs="Times New Roman"/>
+                <w:sz w:val="24"/>
+                <w:szCs w:val="24"/>
+              </w:rPr>
+            </w:pPr>
+            <w:r>
+              <w:rPr>
+                <w:rFonts w:eastAsia="宋体" w:cs="Times New Roman" w:ascii="Times New Roman" w:hAnsi="Times New Roman"/>
+                <w:kern w:val="0"/>
+                <w:sz w:val="24"/>
+                <w:szCs w:val="24"/>
+                <w:lang w:bidi="ar-SA"/>
+              </w:rPr>
+              <w:t>Naufal Dzakki Salva</w:t>
+            </w:r>
+          </w:p>
+          <w:p>
+            <w:pPr>
+              <w:pStyle w:val="ListParagraph"/>
+              <w:widowControl w:val="false"/>
+              <w:numPr>
+                <w:ilvl w:val="0"/>
+                <w:numId w:val="5"/>
+              </w:numPr>
+              <w:suppressAutoHyphens w:val="true"/>
+              <w:spacing w:lineRule="auto" w:line="360" w:before="0" w:after="0"/>
+              <w:ind w:left="0"/>
               <w:contextualSpacing/>
               <w:jc w:val="both"/>
               <w:rPr>
@@ -7802,110 +7948,53 @@
               <w:ind w:hanging="0" w:left="0"/>
               <w:contextualSpacing/>
               <w:jc w:val="both"/>
-              <w:rPr/>
-            </w:pPr>
-            <w:r>
-              <w:rPr>
-                <w:rFonts w:eastAsia="宋体" w:cs="Times New Roman" w:ascii="Times New Roman" w:hAnsi="Times New Roman"/>
-                <w:kern w:val="0"/>
-                <w:sz w:val="24"/>
-                <w:szCs w:val="24"/>
-                <w:lang w:bidi="ar-SA"/>
-              </w:rPr>
-              <w:t xml:space="preserve">16. </w:t>
-            </w:r>
-            <w:r>
-              <w:rPr>
-                <w:rFonts w:eastAsia="宋体" w:cs="Times New Roman" w:ascii="Times New Roman" w:hAnsi="Times New Roman"/>
-                <w:kern w:val="0"/>
-                <w:sz w:val="24"/>
-                <w:szCs w:val="24"/>
-                <w:lang w:bidi="ar-SA"/>
-              </w:rPr>
-              <w:t>Kevin Dwi Nugraha</w:t>
-            </w:r>
-          </w:p>
-          <w:p>
-            <w:pPr>
-              <w:pStyle w:val="Normal"/>
-              <w:widowControl w:val="false"/>
-              <w:suppressAutoHyphens w:val="true"/>
-              <w:spacing w:lineRule="auto" w:line="360" w:before="0" w:after="0"/>
-              <w:jc w:val="both"/>
-              <w:rPr>
-                <w:rFonts w:ascii="Times New Roman" w:hAnsi="Times New Roman" w:cs="Times New Roman"/>
-                <w:sz w:val="24"/>
-                <w:szCs w:val="24"/>
-              </w:rPr>
-            </w:pPr>
-            <w:r>
-              <w:rPr>
-                <w:rFonts w:cs="Times New Roman" w:ascii="Times New Roman" w:hAnsi="Times New Roman"/>
-                <w:sz w:val="24"/>
-                <w:szCs w:val="24"/>
-              </w:rPr>
-            </w:r>
-          </w:p>
-          <w:p>
-            <w:pPr>
-              <w:pStyle w:val="Normal"/>
-              <w:widowControl w:val="false"/>
-              <w:suppressAutoHyphens w:val="true"/>
-              <w:spacing w:lineRule="auto" w:line="360" w:before="0" w:after="0"/>
-              <w:jc w:val="both"/>
-              <w:rPr>
-                <w:rFonts w:ascii="Times New Roman" w:hAnsi="Times New Roman" w:cs="Times New Roman"/>
-                <w:sz w:val="24"/>
-                <w:szCs w:val="24"/>
-              </w:rPr>
-            </w:pPr>
-            <w:r>
-              <w:rPr>
-                <w:rFonts w:cs="Times New Roman" w:ascii="Times New Roman" w:hAnsi="Times New Roman"/>
-                <w:sz w:val="24"/>
-                <w:szCs w:val="24"/>
-              </w:rPr>
-            </w:r>
-          </w:p>
-          <w:p>
-            <w:pPr>
-              <w:pStyle w:val="Normal"/>
-              <w:widowControl w:val="false"/>
-              <w:suppressAutoHyphens w:val="true"/>
-              <w:spacing w:lineRule="auto" w:line="360" w:before="0" w:after="0"/>
-              <w:jc w:val="both"/>
-              <w:rPr>
-                <w:rFonts w:ascii="Times New Roman" w:hAnsi="Times New Roman" w:cs="Times New Roman"/>
-                <w:sz w:val="24"/>
-                <w:szCs w:val="24"/>
-              </w:rPr>
-            </w:pPr>
-            <w:r>
-              <w:rPr>
-                <w:rFonts w:cs="Times New Roman" w:ascii="Times New Roman" w:hAnsi="Times New Roman"/>
-                <w:sz w:val="24"/>
-                <w:szCs w:val="24"/>
-              </w:rPr>
-            </w:r>
-          </w:p>
-          <w:p>
-            <w:pPr>
-              <w:pStyle w:val="Normal"/>
-              <w:widowControl w:val="false"/>
-              <w:suppressAutoHyphens w:val="true"/>
-              <w:spacing w:lineRule="auto" w:line="360" w:before="0" w:after="0"/>
-              <w:jc w:val="both"/>
-              <w:rPr>
-                <w:rFonts w:ascii="Times New Roman" w:hAnsi="Times New Roman" w:cs="Times New Roman"/>
-                <w:sz w:val="24"/>
-                <w:szCs w:val="24"/>
-              </w:rPr>
-            </w:pPr>
-            <w:r>
-              <w:rPr>
-                <w:rFonts w:cs="Times New Roman" w:ascii="Times New Roman" w:hAnsi="Times New Roman"/>
-                <w:sz w:val="24"/>
-                <w:szCs w:val="24"/>
+              <w:rPr>
+                <w:rFonts w:ascii="Times New Roman" w:hAnsi="Times New Roman" w:eastAsia="宋体" w:cs="Times New Roman"/>
+                <w:kern w:val="0"/>
+                <w:sz w:val="24"/>
+                <w:szCs w:val="24"/>
+                <w:lang w:bidi="ar-SA"/>
+              </w:rPr>
+            </w:pPr>
+            <w:r>
+              <w:rPr>
+                <w:rFonts w:eastAsia="宋体" w:cs="Times New Roman" w:ascii="Times New Roman" w:hAnsi="Times New Roman"/>
+                <w:kern w:val="0"/>
+                <w:sz w:val="24"/>
+                <w:szCs w:val="24"/>
+                <w:lang w:bidi="ar-SA"/>
+              </w:rPr>
+              <w:t>16. Kevin Dwi Nugraha</w:t>
+            </w:r>
+          </w:p>
+          <w:p>
+            <w:pPr>
+              <w:pStyle w:val="ListParagraph"/>
+              <w:widowControl w:val="false"/>
+              <w:numPr>
+                <w:ilvl w:val="0"/>
+                <w:numId w:val="0"/>
+              </w:numPr>
+              <w:suppressAutoHyphens w:val="true"/>
+              <w:spacing w:lineRule="auto" w:line="360" w:before="0" w:after="0"/>
+              <w:ind w:hanging="0" w:left="0"/>
+              <w:contextualSpacing/>
+              <w:jc w:val="both"/>
+              <w:rPr>
+                <w:rFonts w:ascii="Times New Roman" w:hAnsi="Times New Roman" w:eastAsia="宋体" w:cs="Times New Roman"/>
+                <w:kern w:val="0"/>
+                <w:sz w:val="24"/>
+                <w:szCs w:val="24"/>
+                <w:lang w:bidi="ar-SA"/>
+              </w:rPr>
+            </w:pPr>
+            <w:r>
+              <w:rPr>
+                <w:rFonts w:eastAsia="宋体" w:cs="Times New Roman" w:ascii="Times New Roman" w:hAnsi="Times New Roman"/>
+                <w:kern w:val="0"/>
+                <w:sz w:val="24"/>
+                <w:szCs w:val="24"/>
+                <w:lang w:bidi="ar-SA"/>
               </w:rPr>
             </w:r>
           </w:p>
@@ -8409,8 +8498,8 @@
       </w:tblPr>
       <w:tblGrid>
         <w:gridCol w:w="1510"/>
-        <w:gridCol w:w="3782"/>
-        <w:gridCol w:w="3734"/>
+        <w:gridCol w:w="3781"/>
+        <w:gridCol w:w="3735"/>
       </w:tblGrid>
       <w:tr>
         <w:trPr/>
@@ -8455,7 +8544,7 @@
         </w:tc>
         <w:tc>
           <w:tcPr>
-            <w:tcW w:w="3782" w:type="dxa"/>
+            <w:tcW w:w="3781" w:type="dxa"/>
             <w:tcBorders>
               <w:top w:val="nil"/>
               <w:left w:val="nil"/>
@@ -8494,7 +8583,7 @@
         </w:tc>
         <w:tc>
           <w:tcPr>
-            <w:tcW w:w="3734" w:type="dxa"/>
+            <w:tcW w:w="3735" w:type="dxa"/>
             <w:tcBorders>
               <w:top w:val="nil"/>
               <w:left w:val="nil"/>
@@ -8572,7 +8661,7 @@
         </w:tc>
         <w:tc>
           <w:tcPr>
-            <w:tcW w:w="3782" w:type="dxa"/>
+            <w:tcW w:w="3781" w:type="dxa"/>
             <w:tcBorders>
               <w:top w:val="nil"/>
               <w:left w:val="nil"/>
@@ -9012,7 +9101,7 @@
         </w:tc>
         <w:tc>
           <w:tcPr>
-            <w:tcW w:w="3734" w:type="dxa"/>
+            <w:tcW w:w="3735" w:type="dxa"/>
             <w:tcBorders>
               <w:top w:val="nil"/>
               <w:left w:val="nil"/>
@@ -9871,19 +9960,7 @@
                 <w:szCs w:val="24"/>
                 <w:lang w:bidi="ar-SA"/>
               </w:rPr>
-              <w:t xml:space="preserve">: </w:t>
-            </w:r>
-            <w:r>
-              <w:rPr>
-                <w:rFonts w:eastAsia="宋体" w:cs="Times New Roman" w:ascii="Times New Roman" w:hAnsi="Times New Roman"/>
-                <w:b/>
-                <w:bCs/>
-                <w:kern w:val="0"/>
-                <w:sz w:val="24"/>
-                <w:szCs w:val="24"/>
-                <w:lang w:bidi="ar-SA"/>
-              </w:rPr>
-              <w:t>Budi Harjo</w:t>
+              <w:t>: Budi Harjo</w:t>
             </w:r>
           </w:p>
         </w:tc>
@@ -10030,17 +10107,7 @@
                 <w:szCs w:val="24"/>
                 <w:lang w:bidi="ar-SA"/>
               </w:rPr>
-              <w:t xml:space="preserve">: 1. </w:t>
-            </w:r>
-            <w:r>
-              <w:rPr>
-                <w:rFonts w:eastAsia="宋体" w:cs="Times New Roman" w:ascii="Times New Roman" w:hAnsi="Times New Roman"/>
-                <w:kern w:val="0"/>
-                <w:sz w:val="24"/>
-                <w:szCs w:val="24"/>
-                <w:lang w:bidi="ar-SA"/>
-              </w:rPr>
-              <w:t>Hendra</w:t>
+              <w:t>: 1. Hendra</w:t>
             </w:r>
           </w:p>
           <w:p>
@@ -10303,39 +10370,27 @@
                 <w:szCs w:val="24"/>
                 <w:lang w:bidi="ar-SA"/>
               </w:rPr>
-              <w:t xml:space="preserve">Ny. Yuniar </w:t>
-            </w:r>
-            <w:r>
-              <w:rPr>
-                <w:rFonts w:eastAsia="宋体" w:cs="Times New Roman" w:ascii="Times New Roman" w:hAnsi="Times New Roman"/>
-                <w:kern w:val="0"/>
-                <w:sz w:val="24"/>
-                <w:szCs w:val="24"/>
-                <w:lang w:bidi="ar-SA"/>
-              </w:rPr>
-              <w:t>Anggraini</w:t>
-            </w:r>
-          </w:p>
-          <w:p>
-            <w:pPr>
-              <w:pStyle w:val="Normal"/>
-              <w:widowControl w:val="false"/>
-              <w:suppressAutoHyphens w:val="true"/>
-              <w:spacing w:lineRule="auto" w:line="360" w:before="0" w:after="0"/>
-              <w:jc w:val="both"/>
-              <w:rPr>
-                <w:rFonts w:ascii="Times New Roman" w:hAnsi="Times New Roman" w:cs="Times New Roman"/>
-                <w:sz w:val="24"/>
-                <w:szCs w:val="24"/>
-              </w:rPr>
-            </w:pPr>
-            <w:r>
-              <w:rPr>
-                <w:rFonts w:eastAsia="宋体" w:cs="Times New Roman" w:ascii="Times New Roman" w:hAnsi="Times New Roman"/>
-                <w:kern w:val="0"/>
-                <w:sz w:val="24"/>
-                <w:szCs w:val="24"/>
-                <w:lang w:bidi="ar-SA"/>
+              <w:t>Ny. Yuniar Anggraini</w:t>
+            </w:r>
+          </w:p>
+          <w:p>
+            <w:pPr>
+              <w:pStyle w:val="Normal"/>
+              <w:widowControl w:val="false"/>
+              <w:suppressAutoHyphens w:val="true"/>
+              <w:spacing w:lineRule="auto" w:line="360" w:before="0" w:after="0"/>
+              <w:jc w:val="both"/>
+              <w:rPr>
+                <w:rFonts w:ascii="Times New Roman" w:hAnsi="Times New Roman" w:cs="Times New Roman"/>
+                <w:sz w:val="24"/>
+                <w:szCs w:val="24"/>
+              </w:rPr>
+            </w:pPr>
+            <w:r>
+              <w:rPr>
+                <w:rFonts w:cs="Times New Roman" w:ascii="Times New Roman" w:hAnsi="Times New Roman"/>
+                <w:sz w:val="24"/>
+                <w:szCs w:val="24"/>
               </w:rPr>
             </w:r>
           </w:p>
@@ -10521,7 +10576,65 @@
                 <w:szCs w:val="24"/>
                 <w:lang w:bidi="ar-SA"/>
               </w:rPr>
-              <w:t>Ditetapkan di    Lalang Sembawa</w:t>
+              <w:t>Ditetapk</w:t>
+            </w:r>
+            <w:r>
+              <w:drawing>
+                <wp:anchor behindDoc="0" distT="0" distB="0" distL="0" distR="0" simplePos="0" locked="0" layoutInCell="1" allowOverlap="1" relativeHeight="5">
+                  <wp:simplePos x="0" y="0"/>
+                  <wp:positionH relativeFrom="column">
+                    <wp:posOffset>502285</wp:posOffset>
+                  </wp:positionH>
+                  <wp:positionV relativeFrom="paragraph">
+                    <wp:posOffset>140335</wp:posOffset>
+                  </wp:positionV>
+                  <wp:extent cx="1596390" cy="1596390"/>
+                  <wp:effectExtent l="0" t="0" r="0" b="0"/>
+                  <wp:wrapNone/>
+                  <wp:docPr id="3" name="Image1 Copy 1" descr=""/>
+                  <wp:cNvGraphicFramePr>
+                    <a:graphicFrameLocks xmlns:a="http://schemas.openxmlformats.org/drawingml/2006/main" noChangeAspect="1"/>
+                  </wp:cNvGraphicFramePr>
+                  <a:graphic xmlns:a="http://schemas.openxmlformats.org/drawingml/2006/main">
+                    <a:graphicData uri="http://schemas.openxmlformats.org/drawingml/2006/picture">
+                      <pic:pic xmlns:pic="http://schemas.openxmlformats.org/drawingml/2006/picture">
+                        <pic:nvPicPr>
+                          <pic:cNvPr id="3" name="Image1 Copy 1" descr=""/>
+                          <pic:cNvPicPr>
+                            <a:picLocks noChangeAspect="1" noChangeArrowheads="1"/>
+                          </pic:cNvPicPr>
+                        </pic:nvPicPr>
+                        <pic:blipFill>
+                          <a:blip r:embed="rId5"/>
+                          <a:stretch>
+                            <a:fillRect/>
+                          </a:stretch>
+                        </pic:blipFill>
+                        <pic:spPr bwMode="auto">
+                          <a:xfrm>
+                            <a:off x="0" y="0"/>
+                            <a:ext cx="1596390" cy="1596390"/>
+                          </a:xfrm>
+                          <a:prstGeom prst="rect">
+                            <a:avLst/>
+                          </a:prstGeom>
+                          <a:noFill/>
+                        </pic:spPr>
+                      </pic:pic>
+                    </a:graphicData>
+                  </a:graphic>
+                </wp:anchor>
+              </w:drawing>
+            </w:r>
+            <w:r>
+              <w:rPr>
+                <w:rFonts w:eastAsia="宋体" w:cs="Times New Roman" w:ascii="Times New Roman" w:hAnsi="Times New Roman"/>
+                <w:kern w:val="0"/>
+                <w:sz w:val="24"/>
+                <w:szCs w:val="24"/>
+                <w:lang w:bidi="ar-SA"/>
+              </w:rPr>
+              <w:t>an di    Lalang Sembawa</w:t>
             </w:r>
           </w:p>
         </w:tc>
@@ -10559,7 +10672,7 @@
                 <w:szCs w:val="24"/>
                 <w:lang w:bidi="ar-SA"/>
               </w:rPr>
-              <w:t>Pada Tanggal          Agustus 2026</w:t>
+              <w:t>Pada Tanggal      01    Agustus 2026</w:t>
             </w:r>
           </w:p>
         </w:tc>
@@ -10682,31 +10795,6 @@
               <w:suppressAutoHyphens w:val="true"/>
               <w:spacing w:before="0" w:after="0"/>
               <w:jc w:val="center"/>
-              <w:rPr>
-                <w:rFonts w:ascii="Times New Roman" w:hAnsi="Times New Roman" w:cs="Times New Roman"/>
-                <w:b/>
-                <w:bCs/>
-                <w:sz w:val="24"/>
-                <w:szCs w:val="24"/>
-              </w:rPr>
-            </w:pPr>
-            <w:r>
-              <w:rPr>
-                <w:rFonts w:cs="Times New Roman" w:ascii="Times New Roman" w:hAnsi="Times New Roman"/>
-                <w:b/>
-                <w:bCs/>
-                <w:sz w:val="24"/>
-                <w:szCs w:val="24"/>
-              </w:rPr>
-            </w:r>
-          </w:p>
-          <w:p>
-            <w:pPr>
-              <w:pStyle w:val="Normal"/>
-              <w:widowControl w:val="false"/>
-              <w:suppressAutoHyphens w:val="true"/>
-              <w:spacing w:before="0" w:after="0"/>
-              <w:jc w:val="left"/>
               <w:rPr>
                 <w:rFonts w:ascii="Times New Roman" w:hAnsi="Times New Roman" w:cs="Times New Roman"/>
                 <w:b/>
@@ -12671,6 +12759,11 @@
     <w:qFormat/>
     <w:rPr/>
   </w:style>
+  <w:style w:type="character" w:styleId="NumberingSymbols">
+    <w:name w:val="Numbering Symbols"/>
+    <w:qFormat/>
+    <w:rPr/>
+  </w:style>
   <w:style w:type="paragraph" w:styleId="Heading">
     <w:name w:val="Heading"/>
     <w:basedOn w:val="Normal"/>

</xml_diff>